<commit_message>
fix: harden artifact templates for release
</commit_message>
<xml_diff>
--- a/library/templates/TMPL-0002/1.0.0/internal-controller-memo.docx
+++ b/library/templates/TMPL-0002/1.0.0/internal-controller-memo.docx
@@ -1172,19 +1172,6 @@
         <w:t>{{appendix_index}}</w:t>
       </w:r>
     </w:p>
-    <w:p>
-      <w:pPr>
-        <w:pStyle w:val="Heading2"/>
-      </w:pPr>
-      <w:r>
-        <w:t>Instantiation gate</w:t>
-      </w:r>
-    </w:p>
-    <w:p>
-      <w:r>
-        <w:t>Replace every double-brace build token, verify citations, classify all notes, render every page, and confirm that no approval, signature, identity, private world fact, or generator residue has been introduced.</w:t>
-      </w:r>
-    </w:p>
     <w:sectPr>
       <w:headerReference w:type="default" r:id="rId9"/>
       <w:footerReference w:type="default" r:id="rId10"/>
@@ -1210,7 +1197,7 @@
         <w:color w:val="666666"/>
         <w:sz w:val="16"/>
       </w:rPr>
-      <w:t>Template status: build-time slots unresolved — not approved</w:t>
+      <w:t>DRAFT — NOT APPROVED</w:t>
     </w:r>
   </w:p>
 </w:ftr>
@@ -1229,7 +1216,7 @@
         <w:color w:val="666666"/>
         <w:sz w:val="16"/>
       </w:rPr>
-      <w:t>SYN STUDIOS  |  INTERNAL WORKING MEMORANDUM TEMPLATE</w:t>
+      <w:t>{{organization_name}}  |  INTERNAL CONTROLLER MEMORANDUM</w:t>
     </w:r>
   </w:p>
 </w:hdr>

</xml_diff>